<commit_message>
Documento di analisi tecnica aggiornato dopo le correzioni
Classifica limitata al girone, regola dei marcatori trasferiti, nuovi
test (102 in totale) e rimozione dei limiti noti risolti.

Co-Authored-By: Claude Opus 5.5 <noreply@anthropic.com>
</commit_message>
<xml_diff>
--- a/docs/Analisi_tecnica_backend.docx
+++ b/docs/Analisi_tecnica_backend.docx
@@ -2715,7 +2715,7 @@
                 <w:rFonts w:ascii="Consolas" w:hAnsi="Consolas"/>
                 <w:sz w:val="17"/>
               </w:rPr>
-              <w:t>├── tests/                 conftest + 8 moduli di test (97 test)</w:t>
+              <w:t>├── tests/                 conftest + 8 moduli di test (102 test)</w:t>
               <w:br/>
             </w:r>
             <w:r>
@@ -8608,7 +8608,7 @@
                 <w:i w:val="0"/>
                 <w:sz w:val="19"/>
               </w:rPr>
-              <w:t>Classifica del girone (solo partite GIRONE giocate)</w:t>
+              <w:t>Classifica sulle squadre passate (solo partite GIRONE giocate)</w:t>
             </w:r>
           </w:p>
         </w:tc>
@@ -8629,7 +8629,7 @@
                 <w:rFonts w:ascii="Consolas" w:hAnsi="Consolas"/>
                 <w:sz w:val="17"/>
               </w:rPr>
-              <w:t>compute_scorers(players, teams)</w:t>
+              <w:t>compute_group_standings(teams, matches)</w:t>
             </w:r>
           </w:p>
         </w:tc>
@@ -8648,7 +8648,7 @@
                 <w:i w:val="0"/>
                 <w:sz w:val="19"/>
               </w:rPr>
-              <w:t>Giocatori con goal &gt; 0, ordinati, posizioni a pari merito (1, 2, 2, 4)</w:t>
+              <w:t>Regola unica per /standings e sync_final_phase: se esiste il girone considera solo le squadre presenti nelle sue partite</w:t>
             </w:r>
           </w:p>
         </w:tc>
@@ -8668,7 +8668,7 @@
                 <w:rFonts w:ascii="Consolas" w:hAnsi="Consolas"/>
                 <w:sz w:val="17"/>
               </w:rPr>
-              <w:t>goals_by_player(matches)</w:t>
+              <w:t>compute_scorers(players, teams)</w:t>
             </w:r>
           </w:p>
         </w:tc>
@@ -8686,7 +8686,7 @@
                 <w:i w:val="0"/>
                 <w:sz w:val="19"/>
               </w:rPr>
-              <w:t>Somma dei goal per giocatore su tutte le partite giocate, autogol esclusi</w:t>
+              <w:t>Giocatori con goal &gt; 0, ordinati, posizioni a pari merito (1, 2, 2, 4)</w:t>
             </w:r>
           </w:p>
         </w:tc>
@@ -8707,7 +8707,7 @@
                 <w:rFonts w:ascii="Consolas" w:hAnsi="Consolas"/>
                 <w:sz w:val="17"/>
               </w:rPr>
-              <w:t>recalculate_goals(store, ids?)</w:t>
+              <w:t>goals_by_player(matches)</w:t>
             </w:r>
           </w:p>
         </w:tc>
@@ -8726,7 +8726,7 @@
                 <w:i w:val="0"/>
                 <w:sz w:val="19"/>
               </w:rPr>
-              <w:t>Riallinea il campo goal; con ids aggiorna solo quei giocatori</w:t>
+              <w:t>Somma dei goal per giocatore su tutte le partite giocate, autogol esclusi</w:t>
             </w:r>
           </w:p>
         </w:tc>
@@ -8746,7 +8746,7 @@
                 <w:rFonts w:ascii="Consolas" w:hAnsi="Consolas"/>
                 <w:sz w:val="17"/>
               </w:rPr>
-              <w:t>views.player_out / match_out</w:t>
+              <w:t>recalculate_goals(store, ids?)</w:t>
             </w:r>
           </w:p>
         </w:tc>
@@ -8764,7 +8764,7 @@
                 <w:i w:val="0"/>
                 <w:sz w:val="19"/>
               </w:rPr>
-              <w:t>Conversione entità → output con nomi e stemmi, su dizionari precaricati</w:t>
+              <w:t>Riallinea il campo goal; con ids aggiorna solo quei giocatori</w:t>
             </w:r>
           </w:p>
         </w:tc>
@@ -8785,7 +8785,7 @@
                 <w:rFonts w:ascii="Consolas" w:hAnsi="Consolas"/>
                 <w:sz w:val="17"/>
               </w:rPr>
-              <w:t>UploadService.save_image</w:t>
+              <w:t>views.player_out / match_out</w:t>
             </w:r>
           </w:p>
         </w:tc>
@@ -8804,7 +8804,7 @@
                 <w:i w:val="0"/>
                 <w:sz w:val="19"/>
               </w:rPr>
-              <w:t>Controllo dimensione (413), file vuoto e formato (422), nome &lt;owner_id&gt;-&lt;8 hex&gt;.&lt;ext&gt;</w:t>
+              <w:t>Conversione entità → output con nomi e stemmi, su dizionari precaricati</w:t>
             </w:r>
           </w:p>
         </w:tc>
@@ -8824,7 +8824,7 @@
                 <w:rFonts w:ascii="Consolas" w:hAnsi="Consolas"/>
                 <w:sz w:val="17"/>
               </w:rPr>
-              <w:t>UploadService.delete</w:t>
+              <w:t>UploadService.save_image</w:t>
             </w:r>
           </w:p>
         </w:tc>
@@ -8842,7 +8842,7 @@
                 <w:i w:val="0"/>
                 <w:sz w:val="19"/>
               </w:rPr>
-              <w:t>Cancella solo file dentro uploads/ (difesa da path traversal)</w:t>
+              <w:t>Controllo dimensione (413), file vuoto e formato (422), nome &lt;owner_id&gt;-&lt;8 hex&gt;.&lt;ext&gt;</w:t>
             </w:r>
           </w:p>
         </w:tc>
@@ -8863,7 +8863,7 @@
                 <w:rFonts w:ascii="Consolas" w:hAnsi="Consolas"/>
                 <w:sz w:val="17"/>
               </w:rPr>
-              <w:t>AuthService.login / verify_token / change_password</w:t>
+              <w:t>UploadService.delete</w:t>
             </w:r>
           </w:p>
         </w:tc>
@@ -8882,7 +8882,7 @@
                 <w:i w:val="0"/>
                 <w:sz w:val="19"/>
               </w:rPr>
-              <w:t>Vedi capitolo sicurezza</w:t>
+              <w:t>Cancella solo file dentro uploads/ (difesa da path traversal)</w:t>
             </w:r>
           </w:p>
         </w:tc>
@@ -8902,6 +8902,45 @@
                 <w:rFonts w:ascii="Consolas" w:hAnsi="Consolas"/>
                 <w:sz w:val="17"/>
               </w:rPr>
+              <w:t>AuthService.login / verify_token / change_password</w:t>
+            </w:r>
+          </w:p>
+        </w:tc>
+        <w:tc>
+          <w:tcPr>
+            <w:tcW w:type="dxa" w:w="5896"/>
+          </w:tcPr>
+          <w:p>
+            <w:pPr>
+              <w:spacing w:after="0"/>
+            </w:pPr>
+            <w:r/>
+            <w:r>
+              <w:rPr>
+                <w:i w:val="0"/>
+                <w:sz w:val="19"/>
+              </w:rPr>
+              <w:t>Vedi capitolo sicurezza</w:t>
+            </w:r>
+          </w:p>
+        </w:tc>
+      </w:tr>
+      <w:tr>
+        <w:tc>
+          <w:tcPr>
+            <w:tcW w:type="dxa" w:w="3515"/>
+            <w:shd w:val="clear" w:color="auto" w:fill="EAF1F8"/>
+          </w:tcPr>
+          <w:p>
+            <w:pPr>
+              <w:spacing w:after="0"/>
+            </w:pPr>
+            <w:r/>
+            <w:r>
+              <w:rPr>
+                <w:rFonts w:ascii="Consolas" w:hAnsi="Consolas"/>
+                <w:sz w:val="17"/>
+              </w:rPr>
               <w:t>set_admin_password(repo, …)</w:t>
             </w:r>
           </w:p>
@@ -8909,6 +8948,7 @@
         <w:tc>
           <w:tcPr>
             <w:tcW w:type="dxa" w:w="5896"/>
+            <w:shd w:val="clear" w:color="auto" w:fill="EAF1F8"/>
           </w:tcPr>
           <w:p>
             <w:pPr>
@@ -13511,7 +13551,7 @@
         <w:rPr>
           <w:i w:val="0"/>
         </w:rPr>
-        <w:t>Il giocatore deve esistere (422) e appartenere a una delle due squadre. Se nel frattempo è stato trasferito, vale la squadra con cui era registrato in precedenza nella stessa partita.</w:t>
+        <w:t>Il giocatore deve esistere (422) e appartenere a una delle due squadre. Se era già tra i marcatori di questa partita vale la squadra registrata allora (se è una delle due in campo), anche se nel frattempo è stato trasferito, persino all'avversaria; altrimenti vale la squadra attuale.</w:t>
       </w:r>
     </w:p>
     <w:p>
@@ -13969,7 +14009,22 @@
         <w:rPr>
           <w:i w:val="0"/>
         </w:rPr>
-        <w:t xml:space="preserve"> considera solo le partite di fase GIRONE giocate: vittoria 3 punti, pareggio 1, sconfitta 0. Compaiono tutte le squadre esistenti, anche senza partite. Ordine:</w:t>
+        <w:t xml:space="preserve"> considera solo le partite di fase GIRONE giocate: vittoria 3 punti, pareggio 1, sconfitta 0. Tramite </w:t>
+      </w:r>
+      <w:r>
+        <w:rPr>
+          <w:rFonts w:ascii="Consolas" w:hAnsi="Consolas"/>
+          <w:i w:val="0"/>
+          <w:color w:val="2E2E2E"/>
+          <w:sz w:val="19"/>
+        </w:rPr>
+        <w:t>compute_group_standings</w:t>
+      </w:r>
+      <w:r>
+        <w:rPr>
+          <w:i w:val="0"/>
+        </w:rPr>
+        <w:t>, se il calendario esiste compaiono solo le squadre presenti nelle partite del girone (una squadra creata dopo la generazione è esclusa da classifica e fase finale); senza calendario compaiono tutte le squadre a 0 punti. Ordine:</w:t>
       </w:r>
     </w:p>
     <w:p>
@@ -14062,7 +14117,7 @@
           <w:color w:val="2E2E2E"/>
           <w:sz w:val="19"/>
         </w:rPr>
-        <w:t>compute_standings</w:t>
+        <w:t>compute_group_standings</w:t>
       </w:r>
       <w:r>
         <w:rPr>
@@ -16122,7 +16177,7 @@
         <w:rPr>
           <w:i w:val="0"/>
         </w:rPr>
-        <w:t>) conta 97 test, eseguiti su una cartella dati temporanea (</w:t>
+        <w:t>) conta 102 test, eseguiti su una cartella dati temporanea (</w:t>
       </w:r>
       <w:r>
         <w:rPr>
@@ -16287,7 +16342,7 @@
                 <w:i w:val="0"/>
                 <w:sz w:val="19"/>
               </w:rPr>
-              <w:t>5</w:t>
+              <w:t>6</w:t>
             </w:r>
           </w:p>
         </w:tc>
@@ -16305,7 +16360,7 @@
                 <w:i w:val="0"/>
                 <w:sz w:val="19"/>
               </w:rPr>
-              <w:t>End-to-end via HTTP: codici 404/422, flusso upload foto, rifiuto di formati e dimensioni non ammessi, eliminazione squadra con 409 e force, torneo completo fino alle finali</w:t>
+              <w:t>End-to-end via HTTP: codici 404/422, flusso upload foto, rifiuto di formati e dimensioni non ammessi, service di upload eseguiti fuori dall'event loop, eliminazione squadra con 409 e force, torneo completo fino alle finali</w:t>
             </w:r>
           </w:p>
         </w:tc>
@@ -16402,7 +16457,7 @@
                 <w:i w:val="0"/>
                 <w:sz w:val="19"/>
               </w:rPr>
-              <w:t>13</w:t>
+              <w:t>14</w:t>
             </w:r>
           </w:p>
         </w:tc>
@@ -16420,7 +16475,7 @@
                 <w:i w:val="0"/>
                 <w:sz w:val="19"/>
               </w:rPr>
-              <w:t>Aggiornamento goal, nessun doppio conteggio, somma tra partite, annullamento, appartenenza del marcatore, coerenza con il punteggio, duplicati, giocatore inesistente, giocatore trasferito, autogol (anche solo autogol e via API)</w:t>
+              <w:t>Aggiornamento goal, nessun doppio conteggio, somma tra partite, annullamento, appartenenza del marcatore, coerenza con il punteggio, duplicati, giocatore inesistente, giocatore trasferito (anche all'avversaria della stessa partita), autogol (anche solo autogol e via API)</w:t>
             </w:r>
           </w:p>
         </w:tc>
@@ -16575,7 +16630,7 @@
                 <w:i w:val="0"/>
                 <w:sz w:val="19"/>
               </w:rPr>
-              <w:t>32</w:t>
+              <w:t>33</w:t>
             </w:r>
           </w:p>
         </w:tc>
@@ -16594,7 +16649,7 @@
                 <w:i w:val="0"/>
                 <w:sz w:val="19"/>
               </w:rPr>
-              <w:t>round_robin per n da 4 a 20 (17 casi), minimo 4 squadre, generazione del solo girone, conferma e reset dei goal, eliminazione, creazione automatica di semifinali e finali con rigori, riallineamento, blocchi sui risultati, PATCH di data/giornata/squadre e relativi divieti</w:t>
+              <w:t>round_robin per n da 4 a 20 (17 casi), minimo 4 squadre, generazione del solo girone, conferma e reset dei goal, eliminazione, creazione automatica di semifinali e finali con rigori, squadra creata dopo il calendario esclusa dalle semifinali, riallineamento, blocchi sui risultati, PATCH di data/giornata/squadre e relativi divieti</w:t>
             </w:r>
           </w:p>
         </w:tc>
@@ -16632,7 +16687,7 @@
                 <w:i w:val="0"/>
                 <w:sz w:val="19"/>
               </w:rPr>
-              <w:t>4</w:t>
+              <w:t>6</w:t>
             </w:r>
           </w:p>
         </w:tc>
@@ -16650,7 +16705,7 @@
                 <w:i w:val="0"/>
                 <w:sz w:val="19"/>
               </w:rPr>
-              <w:t>Punti e statistiche, criteri di spareggio, esclusione di fase finale e partite non giocate, classifica marcatori con pari merito</w:t>
+              <w:t>Punti e statistiche, criteri di spareggio, esclusione di fase finale e partite non giocate, classifica marcatori con pari merito, /standings con e senza calendario (squadre fuori dal girone escluse)</w:t>
             </w:r>
           </w:p>
         </w:tc>
@@ -17697,7 +17752,7 @@
                 <w:i w:val="0"/>
                 <w:sz w:val="19"/>
               </w:rPr>
-              <w:t>Fase finale</w:t>
+              <w:t>Transazioni</w:t>
             </w:r>
           </w:p>
         </w:tc>
@@ -17715,7 +17770,7 @@
                 <w:i w:val="0"/>
                 <w:sz w:val="19"/>
               </w:rPr>
-              <w:t>sync_final_phase calcola la classifica con tutte le squadre esistenti: una squadra creata dopo la generazione del calendario (mai scesa in campo) può qualificarsi alle semifinali se le altre hanno 0 punti e differenza reti negativa. Verificato con uno scenario di prova</w:t>
+              <w:t>transaction() non ha rollback: un errore a metà operazione lascia scritture parziali</w:t>
             </w:r>
           </w:p>
         </w:tc>
@@ -17733,7 +17788,7 @@
                 <w:i w:val="0"/>
                 <w:sz w:val="19"/>
               </w:rPr>
-              <w:t>Correttezza</w:t>
+              <w:t>Coerenza dati</w:t>
             </w:r>
           </w:p>
         </w:tc>
@@ -17754,7 +17809,7 @@
                 <w:i w:val="0"/>
                 <w:sz w:val="19"/>
               </w:rPr>
-              <w:t>Classifica</w:t>
+              <w:t>Rate limit</w:t>
             </w:r>
           </w:p>
         </w:tc>
@@ -17773,7 +17828,7 @@
                 <w:i w:val="0"/>
                 <w:sz w:val="19"/>
               </w:rPr>
-              <w:t>/standings mostra anche le squadre non presenti nel calendario</w:t>
+              <w:t>In memoria e per processo; dietro reverse proxy senza --proxy-headers tutti i client condividono l'IP del proxy; il dizionario degli IP non viene mai ripulito; change-password non è limitato</w:t>
             </w:r>
           </w:p>
         </w:tc>
@@ -17792,237 +17847,7 @@
                 <w:i w:val="0"/>
                 <w:sz w:val="19"/>
               </w:rPr>
-              <w:t>Presentazione</w:t>
-            </w:r>
-          </w:p>
-        </w:tc>
-      </w:tr>
-      <w:tr>
-        <w:tc>
-          <w:tcPr>
-            <w:tcW w:type="dxa" w:w="1587"/>
-          </w:tcPr>
-          <w:p>
-            <w:pPr>
-              <w:spacing w:after="0"/>
-            </w:pPr>
-            <w:r/>
-            <w:r>
-              <w:rPr>
-                <w:i w:val="0"/>
-                <w:sz w:val="19"/>
-              </w:rPr>
-              <w:t>Transazioni</w:t>
-            </w:r>
-          </w:p>
-        </w:tc>
-        <w:tc>
-          <w:tcPr>
-            <w:tcW w:type="dxa" w:w="5896"/>
-          </w:tcPr>
-          <w:p>
-            <w:pPr>
-              <w:spacing w:after="0"/>
-            </w:pPr>
-            <w:r/>
-            <w:r>
-              <w:rPr>
-                <w:i w:val="0"/>
-                <w:sz w:val="19"/>
-              </w:rPr>
-              <w:t>transaction() non ha rollback: un errore a metà operazione lascia scritture parziali</w:t>
-            </w:r>
-          </w:p>
-        </w:tc>
-        <w:tc>
-          <w:tcPr>
-            <w:tcW w:type="dxa" w:w="1928"/>
-          </w:tcPr>
-          <w:p>
-            <w:pPr>
-              <w:spacing w:after="0"/>
-            </w:pPr>
-            <w:r/>
-            <w:r>
-              <w:rPr>
-                <w:i w:val="0"/>
-                <w:sz w:val="19"/>
-              </w:rPr>
-              <w:t>Coerenza dati</w:t>
-            </w:r>
-          </w:p>
-        </w:tc>
-      </w:tr>
-      <w:tr>
-        <w:tc>
-          <w:tcPr>
-            <w:tcW w:type="dxa" w:w="1587"/>
-            <w:shd w:val="clear" w:color="auto" w:fill="EAF1F8"/>
-          </w:tcPr>
-          <w:p>
-            <w:pPr>
-              <w:spacing w:after="0"/>
-            </w:pPr>
-            <w:r/>
-            <w:r>
-              <w:rPr>
-                <w:i w:val="0"/>
-                <w:sz w:val="19"/>
-              </w:rPr>
-              <w:t>Event loop</w:t>
-            </w:r>
-          </w:p>
-        </w:tc>
-        <w:tc>
-          <w:tcPr>
-            <w:tcW w:type="dxa" w:w="5896"/>
-            <w:shd w:val="clear" w:color="auto" w:fill="EAF1F8"/>
-          </w:tcPr>
-          <w:p>
-            <w:pPr>
-              <w:spacing w:after="0"/>
-            </w:pPr>
-            <w:r/>
-            <w:r>
-              <w:rPr>
-                <w:i w:val="0"/>
-                <w:sz w:val="19"/>
-              </w:rPr>
-              <w:t>Gli endpoint di upload sono async ma chiamano service sincroni (I/O su file, FileLock con timeout fino a 10 s) bloccando il loop</w:t>
-            </w:r>
-          </w:p>
-        </w:tc>
-        <w:tc>
-          <w:tcPr>
-            <w:tcW w:type="dxa" w:w="1928"/>
-            <w:shd w:val="clear" w:color="auto" w:fill="EAF1F8"/>
-          </w:tcPr>
-          <w:p>
-            <w:pPr>
-              <w:spacing w:after="0"/>
-            </w:pPr>
-            <w:r/>
-            <w:r>
-              <w:rPr>
-                <w:i w:val="0"/>
-                <w:sz w:val="19"/>
-              </w:rPr>
-              <w:t>Prestazioni</w:t>
-            </w:r>
-          </w:p>
-        </w:tc>
-      </w:tr>
-      <w:tr>
-        <w:tc>
-          <w:tcPr>
-            <w:tcW w:type="dxa" w:w="1587"/>
-          </w:tcPr>
-          <w:p>
-            <w:pPr>
-              <w:spacing w:after="0"/>
-            </w:pPr>
-            <w:r/>
-            <w:r>
-              <w:rPr>
-                <w:i w:val="0"/>
-                <w:sz w:val="19"/>
-              </w:rPr>
-              <w:t>Rate limit</w:t>
-            </w:r>
-          </w:p>
-        </w:tc>
-        <w:tc>
-          <w:tcPr>
-            <w:tcW w:type="dxa" w:w="5896"/>
-          </w:tcPr>
-          <w:p>
-            <w:pPr>
-              <w:spacing w:after="0"/>
-            </w:pPr>
-            <w:r/>
-            <w:r>
-              <w:rPr>
-                <w:i w:val="0"/>
-                <w:sz w:val="19"/>
-              </w:rPr>
-              <w:t>In memoria e per processo; dietro reverse proxy senza --proxy-headers tutti i client condividono l'IP del proxy; il dizionario degli IP non viene mai ripulito; change-password non è limitato</w:t>
-            </w:r>
-          </w:p>
-        </w:tc>
-        <w:tc>
-          <w:tcPr>
-            <w:tcW w:type="dxa" w:w="1928"/>
-          </w:tcPr>
-          <w:p>
-            <w:pPr>
-              <w:spacing w:after="0"/>
-            </w:pPr>
-            <w:r/>
-            <w:r>
-              <w:rPr>
-                <w:i w:val="0"/>
-                <w:sz w:val="19"/>
-              </w:rPr>
               <w:t>Sicurezza</w:t>
-            </w:r>
-          </w:p>
-        </w:tc>
-      </w:tr>
-      <w:tr>
-        <w:tc>
-          <w:tcPr>
-            <w:tcW w:type="dxa" w:w="1587"/>
-            <w:shd w:val="clear" w:color="auto" w:fill="EAF1F8"/>
-          </w:tcPr>
-          <w:p>
-            <w:pPr>
-              <w:spacing w:after="0"/>
-            </w:pPr>
-            <w:r/>
-            <w:r>
-              <w:rPr>
-                <w:i w:val="0"/>
-                <w:sz w:val="19"/>
-              </w:rPr>
-              <w:t>Marcatori</w:t>
-            </w:r>
-          </w:p>
-        </w:tc>
-        <w:tc>
-          <w:tcPr>
-            <w:tcW w:type="dxa" w:w="5896"/>
-            <w:shd w:val="clear" w:color="auto" w:fill="EAF1F8"/>
-          </w:tcPr>
-          <w:p>
-            <w:pPr>
-              <w:spacing w:after="0"/>
-            </w:pPr>
-            <w:r/>
-            <w:r>
-              <w:rPr>
-                <w:i w:val="0"/>
-                <w:sz w:val="19"/>
-              </w:rPr>
-              <w:t>Se un giocatore passa da una squadra all'altra della stessa partita, al successivo salvataggio del risultato i suoi gol vengono attribuiti alla nuova squadra (422 o scambio)</w:t>
-            </w:r>
-          </w:p>
-        </w:tc>
-        <w:tc>
-          <w:tcPr>
-            <w:tcW w:type="dxa" w:w="1928"/>
-            <w:shd w:val="clear" w:color="auto" w:fill="EAF1F8"/>
-          </w:tcPr>
-          <w:p>
-            <w:pPr>
-              <w:spacing w:after="0"/>
-            </w:pPr>
-            <w:r/>
-            <w:r>
-              <w:rPr>
-                <w:i w:val="0"/>
-                <w:sz w:val="19"/>
-              </w:rPr>
-              <w:t>Correttezza (caso raro)</w:t>
             </w:r>
           </w:p>
         </w:tc>
@@ -18352,45 +18177,6 @@
           <w:i w:val="0"/>
         </w:rPr>
         <w:t>, con transazioni reali.</w:t>
-      </w:r>
-    </w:p>
-    <w:p>
-      <w:pPr>
-        <w:pStyle w:val="ListBullet"/>
-        <w:spacing w:after="40"/>
-      </w:pPr>
-      <w:r>
-        <w:rPr>
-          <w:i w:val="0"/>
-        </w:rPr>
-        <w:t>Limitare la classifica e la qualificazione alle squadre presenti nelle partite del girone.</w:t>
-      </w:r>
-    </w:p>
-    <w:p>
-      <w:pPr>
-        <w:pStyle w:val="ListBullet"/>
-        <w:spacing w:after="40"/>
-      </w:pPr>
-      <w:r>
-        <w:rPr>
-          <w:i w:val="0"/>
-        </w:rPr>
-        <w:t xml:space="preserve">Rendere sincroni gli endpoint di upload (thread pool) o spostare le chiamate bloccanti in </w:t>
-      </w:r>
-      <w:r>
-        <w:rPr>
-          <w:rFonts w:ascii="Consolas" w:hAnsi="Consolas"/>
-          <w:i w:val="0"/>
-          <w:color w:val="2E2E2E"/>
-          <w:sz w:val="19"/>
-        </w:rPr>
-        <w:t>run_in_threadpool</w:t>
-      </w:r>
-      <w:r>
-        <w:rPr>
-          <w:i w:val="0"/>
-        </w:rPr>
-        <w:t>.</w:t>
       </w:r>
     </w:p>
     <w:p>

</xml_diff>